<commit_message>
Refresh documentation for current RAG workflow
</commit_message>
<xml_diff>
--- a/shared_output/Q1_Retrieval_Design/Q1_Retrieval_Design.docx
+++ b/shared_output/Q1_Retrieval_Design/Q1_Retrieval_Design.docx
@@ -105,7 +105,7 @@
           <w:color w:val="1F2937"/>
           <w:sz w:val="22"/>
         </w:rPr>
-        <w:t>The current ingestion produces 1,036 chunks from the six workbooks. Chunk text averages 1,593 characters; the longest is 2,663 characters after adding section context. These observations support paragraph-aware splitting rather than a fixed token window over flattened workbook text.</w:t>
+        <w:t>The current ingestion produces 1,036 chunks from the six workbooks. Chunk lengths are validated during ingestion; the current maximum complete chunk is 4,868 characters. These observations support paragraph-aware splitting rather than a fixed token window over flattened workbook text.</w:t>
       </w:r>
     </w:p>
     <w:p>
@@ -627,7 +627,7 @@
           <w:color w:val="1F2937"/>
           <w:sz w:val="22"/>
         </w:rPr>
-        <w:t>Use k = 4 chunks for answer generation as an initial operating point, while retaining the larger candidate pool for trace and evaluation. Four chunks usually fit the 4,096-token local-model context together with the question and instructions. Increase k for comparison questions that require multiple diseases or sections; reduce it for narrow definitions. Select the final value on a 15–20 question golden set by plotting Recall@k against context size, latency, and faithfulness, choosing the smallest k that reaches the recall target.</w:t>
+        <w:t>Use k = 6 chunks for answer generation as the current operating point, while each retriever produces at least 20 candidates before fusion. Calibrate the value on the golden set against recall, context size, latency, and faithfulness; increase k for comparisons and reduce it for narrow definitions. Select the final value on a 15–20 question golden set by plotting Recall@k against context size, latency, and faithfulness, choosing the smallest k that reaches the recall target.</w:t>
       </w:r>
     </w:p>
     <w:p>

</xml_diff>

<commit_message>
Add read-only Chroma guardrail and refresh deliverables
</commit_message>
<xml_diff>
--- a/shared_output/Q1_Retrieval_Design/Q1_Retrieval_Design.docx
+++ b/shared_output/Q1_Retrieval_Design/Q1_Retrieval_Design.docx
@@ -633,6 +633,12 @@
     <w:p>
       <w:pPr/>
       <w:r>
+        <w:t>Measured validation sample. In the three-question local Ragas sample (Q220, Q1016, and Q1226), context precision and context recall were 1.0000 for every question. This supports the current hybrid retrieval configuration for those examples, but it is not a substitute for deterministic Recall@k/MRR on the frozen golden set or evidence that hybrid retrieval always outperforms vector-only search.</w:t>
+      </w:r>
+    </w:p>
+    <w:p>
+      <w:pPr/>
+      <w:r>
         <w:rPr>
           <w:rFonts w:ascii="Calibri" w:hAnsi="Calibri"/>
           <w:b/>

</xml_diff>